<commit_message>
docs: record official T1-T6 results from live webcam tests
</commit_message>
<xml_diff>
--- a/docs/IRIS-Laporan-Stage2.docx
+++ b/docs/IRIS-Laporan-Stage2.docx
@@ -215,7 +215,7 @@
     <w:sdt>
       <w:sdtPr>
         <w:alias w:val="Daftar Isi"/>
-        <w:id w:val="665678422"/>
+        <w:id w:val="-449936900"/>
         <w:docPartObj>
           <w:docPartGallery w:val="Table of Contents"/>
           <w:docPartUnique/>
@@ -248,7 +248,7 @@
           <w:r>
             <w:fldChar w:fldCharType="separate"/>
           </w:r>
-          <w:hyperlink w:anchor="_Toc244278604" w:history="1">
+          <w:hyperlink w:anchor="_Toc244278729" w:history="1">
             <w:r>
               <w:rPr>
                 <w:rStyle w:val="Hyperlink"/>
@@ -272,7 +272,7 @@
               <w:rPr>
                 <w:noProof/>
               </w:rPr>
-              <w:instrText xml:space="preserve"> PAGEREF _Toc244278604 \h </w:instrText>
+              <w:instrText xml:space="preserve"> PAGEREF _Toc244278729 \h </w:instrText>
             </w:r>
             <w:r>
               <w:rPr>
@@ -315,7 +315,7 @@
               <w14:ligatures w14:val="standardContextual"/>
             </w:rPr>
           </w:pPr>
-          <w:hyperlink w:anchor="_Toc244278605" w:history="1">
+          <w:hyperlink w:anchor="_Toc244278730" w:history="1">
             <w:r>
               <w:rPr>
                 <w:rStyle w:val="Hyperlink"/>
@@ -339,7 +339,7 @@
               <w:rPr>
                 <w:noProof/>
               </w:rPr>
-              <w:instrText xml:space="preserve"> PAGEREF _Toc244278605 \h </w:instrText>
+              <w:instrText xml:space="preserve"> PAGEREF _Toc244278730 \h </w:instrText>
             </w:r>
             <w:r>
               <w:rPr>
@@ -382,7 +382,7 @@
               <w14:ligatures w14:val="standardContextual"/>
             </w:rPr>
           </w:pPr>
-          <w:hyperlink w:anchor="_Toc244278606" w:history="1">
+          <w:hyperlink w:anchor="_Toc244278731" w:history="1">
             <w:r>
               <w:rPr>
                 <w:rStyle w:val="Hyperlink"/>
@@ -406,7 +406,7 @@
               <w:rPr>
                 <w:noProof/>
               </w:rPr>
-              <w:instrText xml:space="preserve"> PAGEREF _Toc244278606 \h </w:instrText>
+              <w:instrText xml:space="preserve"> PAGEREF _Toc244278731 \h </w:instrText>
             </w:r>
             <w:r>
               <w:rPr>
@@ -449,7 +449,7 @@
               <w14:ligatures w14:val="standardContextual"/>
             </w:rPr>
           </w:pPr>
-          <w:hyperlink w:anchor="_Toc244278607" w:history="1">
+          <w:hyperlink w:anchor="_Toc244278732" w:history="1">
             <w:r>
               <w:rPr>
                 <w:rStyle w:val="Hyperlink"/>
@@ -473,7 +473,7 @@
               <w:rPr>
                 <w:noProof/>
               </w:rPr>
-              <w:instrText xml:space="preserve"> PAGEREF _Toc244278607 \h </w:instrText>
+              <w:instrText xml:space="preserve"> PAGEREF _Toc244278732 \h </w:instrText>
             </w:r>
             <w:r>
               <w:rPr>
@@ -516,7 +516,7 @@
               <w14:ligatures w14:val="standardContextual"/>
             </w:rPr>
           </w:pPr>
-          <w:hyperlink w:anchor="_Toc244278608" w:history="1">
+          <w:hyperlink w:anchor="_Toc244278733" w:history="1">
             <w:r>
               <w:rPr>
                 <w:rStyle w:val="Hyperlink"/>
@@ -540,7 +540,7 @@
               <w:rPr>
                 <w:noProof/>
               </w:rPr>
-              <w:instrText xml:space="preserve"> PAGEREF _Toc244278608 \h </w:instrText>
+              <w:instrText xml:space="preserve"> PAGEREF _Toc244278733 \h </w:instrText>
             </w:r>
             <w:r>
               <w:rPr>
@@ -583,7 +583,7 @@
               <w14:ligatures w14:val="standardContextual"/>
             </w:rPr>
           </w:pPr>
-          <w:hyperlink w:anchor="_Toc244278609" w:history="1">
+          <w:hyperlink w:anchor="_Toc244278734" w:history="1">
             <w:r>
               <w:rPr>
                 <w:rStyle w:val="Hyperlink"/>
@@ -607,7 +607,7 @@
               <w:rPr>
                 <w:noProof/>
               </w:rPr>
-              <w:instrText xml:space="preserve"> PAGEREF _Toc244278609 \h </w:instrText>
+              <w:instrText xml:space="preserve"> PAGEREF _Toc244278734 \h </w:instrText>
             </w:r>
             <w:r>
               <w:rPr>
@@ -650,7 +650,7 @@
               <w14:ligatures w14:val="standardContextual"/>
             </w:rPr>
           </w:pPr>
-          <w:hyperlink w:anchor="_Toc244278610" w:history="1">
+          <w:hyperlink w:anchor="_Toc244278735" w:history="1">
             <w:r>
               <w:rPr>
                 <w:rStyle w:val="Hyperlink"/>
@@ -674,7 +674,7 @@
               <w:rPr>
                 <w:noProof/>
               </w:rPr>
-              <w:instrText xml:space="preserve"> PAGEREF _Toc244278610 \h </w:instrText>
+              <w:instrText xml:space="preserve"> PAGEREF _Toc244278735 \h </w:instrText>
             </w:r>
             <w:r>
               <w:rPr>
@@ -717,7 +717,7 @@
               <w14:ligatures w14:val="standardContextual"/>
             </w:rPr>
           </w:pPr>
-          <w:hyperlink w:anchor="_Toc244278611" w:history="1">
+          <w:hyperlink w:anchor="_Toc244278736" w:history="1">
             <w:r>
               <w:rPr>
                 <w:rStyle w:val="Hyperlink"/>
@@ -741,7 +741,7 @@
               <w:rPr>
                 <w:noProof/>
               </w:rPr>
-              <w:instrText xml:space="preserve"> PAGEREF _Toc244278611 \h </w:instrText>
+              <w:instrText xml:space="preserve"> PAGEREF _Toc244278736 \h </w:instrText>
             </w:r>
             <w:r>
               <w:rPr>
@@ -784,7 +784,7 @@
               <w14:ligatures w14:val="standardContextual"/>
             </w:rPr>
           </w:pPr>
-          <w:hyperlink w:anchor="_Toc244278612" w:history="1">
+          <w:hyperlink w:anchor="_Toc244278737" w:history="1">
             <w:r>
               <w:rPr>
                 <w:rStyle w:val="Hyperlink"/>
@@ -808,7 +808,7 @@
               <w:rPr>
                 <w:noProof/>
               </w:rPr>
-              <w:instrText xml:space="preserve"> PAGEREF _Toc244278612 \h </w:instrText>
+              <w:instrText xml:space="preserve"> PAGEREF _Toc244278737 \h </w:instrText>
             </w:r>
             <w:r>
               <w:rPr>
@@ -851,7 +851,7 @@
               <w14:ligatures w14:val="standardContextual"/>
             </w:rPr>
           </w:pPr>
-          <w:hyperlink w:anchor="_Toc244278613" w:history="1">
+          <w:hyperlink w:anchor="_Toc244278738" w:history="1">
             <w:r>
               <w:rPr>
                 <w:rStyle w:val="Hyperlink"/>
@@ -875,7 +875,7 @@
               <w:rPr>
                 <w:noProof/>
               </w:rPr>
-              <w:instrText xml:space="preserve"> PAGEREF _Toc244278613 \h </w:instrText>
+              <w:instrText xml:space="preserve"> PAGEREF _Toc244278738 \h </w:instrText>
             </w:r>
             <w:r>
               <w:rPr>
@@ -918,7 +918,7 @@
               <w14:ligatures w14:val="standardContextual"/>
             </w:rPr>
           </w:pPr>
-          <w:hyperlink w:anchor="_Toc244278614" w:history="1">
+          <w:hyperlink w:anchor="_Toc244278739" w:history="1">
             <w:r>
               <w:rPr>
                 <w:rStyle w:val="Hyperlink"/>
@@ -942,7 +942,7 @@
               <w:rPr>
                 <w:noProof/>
               </w:rPr>
-              <w:instrText xml:space="preserve"> PAGEREF _Toc244278614 \h </w:instrText>
+              <w:instrText xml:space="preserve"> PAGEREF _Toc244278739 \h </w:instrText>
             </w:r>
             <w:r>
               <w:rPr>
@@ -985,7 +985,7 @@
               <w14:ligatures w14:val="standardContextual"/>
             </w:rPr>
           </w:pPr>
-          <w:hyperlink w:anchor="_Toc244278615" w:history="1">
+          <w:hyperlink w:anchor="_Toc244278740" w:history="1">
             <w:r>
               <w:rPr>
                 <w:rStyle w:val="Hyperlink"/>
@@ -1009,7 +1009,7 @@
               <w:rPr>
                 <w:noProof/>
               </w:rPr>
-              <w:instrText xml:space="preserve"> PAGEREF _Toc244278615 \h </w:instrText>
+              <w:instrText xml:space="preserve"> PAGEREF _Toc244278740 \h </w:instrText>
             </w:r>
             <w:r>
               <w:rPr>
@@ -1052,7 +1052,7 @@
               <w14:ligatures w14:val="standardContextual"/>
             </w:rPr>
           </w:pPr>
-          <w:hyperlink w:anchor="_Toc244278616" w:history="1">
+          <w:hyperlink w:anchor="_Toc244278741" w:history="1">
             <w:r>
               <w:rPr>
                 <w:rStyle w:val="Hyperlink"/>
@@ -1076,7 +1076,7 @@
               <w:rPr>
                 <w:noProof/>
               </w:rPr>
-              <w:instrText xml:space="preserve"> PAGEREF _Toc244278616 \h </w:instrText>
+              <w:instrText xml:space="preserve"> PAGEREF _Toc244278741 \h </w:instrText>
             </w:r>
             <w:r>
               <w:rPr>
@@ -1119,7 +1119,7 @@
               <w14:ligatures w14:val="standardContextual"/>
             </w:rPr>
           </w:pPr>
-          <w:hyperlink w:anchor="_Toc244278617" w:history="1">
+          <w:hyperlink w:anchor="_Toc244278742" w:history="1">
             <w:r>
               <w:rPr>
                 <w:rStyle w:val="Hyperlink"/>
@@ -1143,7 +1143,7 @@
               <w:rPr>
                 <w:noProof/>
               </w:rPr>
-              <w:instrText xml:space="preserve"> PAGEREF _Toc244278617 \h </w:instrText>
+              <w:instrText xml:space="preserve"> PAGEREF _Toc244278742 \h </w:instrText>
             </w:r>
             <w:r>
               <w:rPr>
@@ -1186,7 +1186,7 @@
               <w14:ligatures w14:val="standardContextual"/>
             </w:rPr>
           </w:pPr>
-          <w:hyperlink w:anchor="_Toc244278618" w:history="1">
+          <w:hyperlink w:anchor="_Toc244278743" w:history="1">
             <w:r>
               <w:rPr>
                 <w:rStyle w:val="Hyperlink"/>
@@ -1210,7 +1210,7 @@
               <w:rPr>
                 <w:noProof/>
               </w:rPr>
-              <w:instrText xml:space="preserve"> PAGEREF _Toc244278618 \h </w:instrText>
+              <w:instrText xml:space="preserve"> PAGEREF _Toc244278743 \h </w:instrText>
             </w:r>
             <w:r>
               <w:rPr>
@@ -1253,7 +1253,7 @@
               <w14:ligatures w14:val="standardContextual"/>
             </w:rPr>
           </w:pPr>
-          <w:hyperlink w:anchor="_Toc244278619" w:history="1">
+          <w:hyperlink w:anchor="_Toc244278744" w:history="1">
             <w:r>
               <w:rPr>
                 <w:rStyle w:val="Hyperlink"/>
@@ -1277,7 +1277,7 @@
               <w:rPr>
                 <w:noProof/>
               </w:rPr>
-              <w:instrText xml:space="preserve"> PAGEREF _Toc244278619 \h </w:instrText>
+              <w:instrText xml:space="preserve"> PAGEREF _Toc244278744 \h </w:instrText>
             </w:r>
             <w:r>
               <w:rPr>
@@ -1320,7 +1320,7 @@
               <w14:ligatures w14:val="standardContextual"/>
             </w:rPr>
           </w:pPr>
-          <w:hyperlink w:anchor="_Toc244278620" w:history="1">
+          <w:hyperlink w:anchor="_Toc244278745" w:history="1">
             <w:r>
               <w:rPr>
                 <w:rStyle w:val="Hyperlink"/>
@@ -1344,7 +1344,7 @@
               <w:rPr>
                 <w:noProof/>
               </w:rPr>
-              <w:instrText xml:space="preserve"> PAGEREF _Toc244278620 \h </w:instrText>
+              <w:instrText xml:space="preserve"> PAGEREF _Toc244278745 \h </w:instrText>
             </w:r>
             <w:r>
               <w:rPr>
@@ -1387,7 +1387,7 @@
               <w14:ligatures w14:val="standardContextual"/>
             </w:rPr>
           </w:pPr>
-          <w:hyperlink w:anchor="_Toc244278621" w:history="1">
+          <w:hyperlink w:anchor="_Toc244278746" w:history="1">
             <w:r>
               <w:rPr>
                 <w:rStyle w:val="Hyperlink"/>
@@ -1411,7 +1411,7 @@
               <w:rPr>
                 <w:noProof/>
               </w:rPr>
-              <w:instrText xml:space="preserve"> PAGEREF _Toc244278621 \h </w:instrText>
+              <w:instrText xml:space="preserve"> PAGEREF _Toc244278746 \h </w:instrText>
             </w:r>
             <w:r>
               <w:rPr>
@@ -1454,7 +1454,7 @@
               <w14:ligatures w14:val="standardContextual"/>
             </w:rPr>
           </w:pPr>
-          <w:hyperlink w:anchor="_Toc244278622" w:history="1">
+          <w:hyperlink w:anchor="_Toc244278747" w:history="1">
             <w:r>
               <w:rPr>
                 <w:rStyle w:val="Hyperlink"/>
@@ -1478,7 +1478,7 @@
               <w:rPr>
                 <w:noProof/>
               </w:rPr>
-              <w:instrText xml:space="preserve"> PAGEREF _Toc244278622 \h </w:instrText>
+              <w:instrText xml:space="preserve"> PAGEREF _Toc244278747 \h </w:instrText>
             </w:r>
             <w:r>
               <w:rPr>
@@ -1521,7 +1521,7 @@
               <w14:ligatures w14:val="standardContextual"/>
             </w:rPr>
           </w:pPr>
-          <w:hyperlink w:anchor="_Toc244278623" w:history="1">
+          <w:hyperlink w:anchor="_Toc244278748" w:history="1">
             <w:r>
               <w:rPr>
                 <w:rStyle w:val="Hyperlink"/>
@@ -1545,7 +1545,7 @@
               <w:rPr>
                 <w:noProof/>
               </w:rPr>
-              <w:instrText xml:space="preserve"> PAGEREF _Toc244278623 \h </w:instrText>
+              <w:instrText xml:space="preserve"> PAGEREF _Toc244278748 \h </w:instrText>
             </w:r>
             <w:r>
               <w:rPr>
@@ -1588,7 +1588,7 @@
               <w14:ligatures w14:val="standardContextual"/>
             </w:rPr>
           </w:pPr>
-          <w:hyperlink w:anchor="_Toc244278624" w:history="1">
+          <w:hyperlink w:anchor="_Toc244278749" w:history="1">
             <w:r>
               <w:rPr>
                 <w:rStyle w:val="Hyperlink"/>
@@ -1612,7 +1612,7 @@
               <w:rPr>
                 <w:noProof/>
               </w:rPr>
-              <w:instrText xml:space="preserve"> PAGEREF _Toc244278624 \h </w:instrText>
+              <w:instrText xml:space="preserve"> PAGEREF _Toc244278749 \h </w:instrText>
             </w:r>
             <w:r>
               <w:rPr>
@@ -1655,7 +1655,7 @@
               <w14:ligatures w14:val="standardContextual"/>
             </w:rPr>
           </w:pPr>
-          <w:hyperlink w:anchor="_Toc244278625" w:history="1">
+          <w:hyperlink w:anchor="_Toc244278750" w:history="1">
             <w:r>
               <w:rPr>
                 <w:rStyle w:val="Hyperlink"/>
@@ -1679,7 +1679,7 @@
               <w:rPr>
                 <w:noProof/>
               </w:rPr>
-              <w:instrText xml:space="preserve"> PAGEREF _Toc244278625 \h </w:instrText>
+              <w:instrText xml:space="preserve"> PAGEREF _Toc244278750 \h </w:instrText>
             </w:r>
             <w:r>
               <w:rPr>
@@ -1722,7 +1722,7 @@
       <w:pPr>
         <w:pStyle w:val="Heading1"/>
       </w:pPr>
-      <w:bookmarkStart w:id="0" w:name="_Toc244278604"/>
+      <w:bookmarkStart w:id="0" w:name="_Toc244278729"/>
       <w:r>
         <w:lastRenderedPageBreak/>
         <w:t>1. Latar Belakang Masalah</w:t>
@@ -1790,7 +1790,7 @@
       <w:pPr>
         <w:pStyle w:val="Heading1"/>
       </w:pPr>
-      <w:bookmarkStart w:id="1" w:name="_Toc244278605"/>
+      <w:bookmarkStart w:id="1" w:name="_Toc244278730"/>
       <w:r>
         <w:t>2. Problem Statement dan Tujuan</w:t>
       </w:r>
@@ -1902,7 +1902,7 @@
       <w:pPr>
         <w:pStyle w:val="Heading1"/>
       </w:pPr>
-      <w:bookmarkStart w:id="2" w:name="_Toc244278606"/>
+      <w:bookmarkStart w:id="2" w:name="_Toc244278731"/>
       <w:r>
         <w:t>3. Target User dan Use Case</w:t>
       </w:r>
@@ -2230,7 +2230,7 @@
       <w:pPr>
         <w:pStyle w:val="Heading1"/>
       </w:pPr>
-      <w:bookmarkStart w:id="3" w:name="_Toc244278607"/>
+      <w:bookmarkStart w:id="3" w:name="_Toc244278732"/>
       <w:r>
         <w:lastRenderedPageBreak/>
         <w:t>4. System Architecture dan Block Diagram</w:t>
@@ -2248,7 +2248,7 @@
           <w:noProof/>
         </w:rPr>
         <w:drawing>
-          <wp:inline distT="0" distB="0" distL="0" distR="0" wp14:anchorId="23799989" wp14:editId="0B03D5A5">
+          <wp:inline distT="0" distB="0" distL="0" distR="0" wp14:anchorId="214CC8A0" wp14:editId="19B9602B">
             <wp:extent cx="5724525" cy="3305175"/>
             <wp:effectExtent l="0" t="0" r="0" b="0"/>
             <wp:docPr id="1" name="arsitektur" descr="Block diagram sistem IRIS" title="Block diagram sistem IRIS"/>
@@ -2423,7 +2423,7 @@
       <w:pPr>
         <w:pStyle w:val="Heading1"/>
       </w:pPr>
-      <w:bookmarkStart w:id="4" w:name="_Toc244278608"/>
+      <w:bookmarkStart w:id="4" w:name="_Toc244278733"/>
       <w:r>
         <w:t>5. Daftar Komponen dan Alasan Pemilihan</w:t>
       </w:r>
@@ -3473,7 +3473,7 @@
       <w:pPr>
         <w:pStyle w:val="Heading1"/>
       </w:pPr>
-      <w:bookmarkStart w:id="5" w:name="_Toc244278609"/>
+      <w:bookmarkStart w:id="5" w:name="_Toc244278734"/>
       <w:r>
         <w:t>6. Wokwi Circuit dan Wiring Diagram</w:t>
       </w:r>
@@ -3510,7 +3510,7 @@
           <w:noProof/>
         </w:rPr>
         <w:drawing>
-          <wp:inline distT="0" distB="0" distL="0" distR="0" wp14:anchorId="2D27C940" wp14:editId="6A605977">
+          <wp:inline distT="0" distB="0" distL="0" distR="0" wp14:anchorId="77AB1461" wp14:editId="7939C75E">
             <wp:extent cx="5219700" cy="3143250"/>
             <wp:effectExtent l="0" t="0" r="0" b="0"/>
             <wp:docPr id="2" name="circuit" descr="Rangkaian IRIS di Wokwi" title="Rangkaian IRIS di Wokwi"/>
@@ -3629,7 +3629,7 @@
       <w:pPr>
         <w:pStyle w:val="Heading1"/>
       </w:pPr>
-      <w:bookmarkStart w:id="6" w:name="_Toc244278610"/>
+      <w:bookmarkStart w:id="6" w:name="_Toc244278735"/>
       <w:r>
         <w:lastRenderedPageBreak/>
         <w:t>7. Pin/GPIO yang Digunakan</w:t>
@@ -4449,7 +4449,7 @@
       <w:pPr>
         <w:pStyle w:val="Heading1"/>
       </w:pPr>
-      <w:bookmarkStart w:id="7" w:name="_Toc244278611"/>
+      <w:bookmarkStart w:id="7" w:name="_Toc244278736"/>
       <w:r>
         <w:t>8. Penjelasan Logika Program</w:t>
       </w:r>
@@ -4459,7 +4459,7 @@
       <w:pPr>
         <w:pStyle w:val="Heading2"/>
       </w:pPr>
-      <w:bookmarkStart w:id="8" w:name="_Toc244278612"/>
+      <w:bookmarkStart w:id="8" w:name="_Toc244278737"/>
       <w:r>
         <w:t>8.1 Firmware ESP32 (state machine)</w:t>
       </w:r>
@@ -4485,7 +4485,7 @@
           <w:noProof/>
         </w:rPr>
         <w:drawing>
-          <wp:inline distT="0" distB="0" distL="0" distR="0" wp14:anchorId="0D55136F" wp14:editId="13D73DB4">
+          <wp:inline distT="0" distB="0" distL="0" distR="0" wp14:anchorId="38A26459" wp14:editId="48F08645">
             <wp:extent cx="5724525" cy="2495550"/>
             <wp:effectExtent l="0" t="0" r="0" b="0"/>
             <wp:docPr id="3" name="state" descr="State machine ESP32 pada mode gerbang dan zona" title="State machine ESP32 pada mode gerbang dan zona"/>
@@ -4704,7 +4704,7 @@
       <w:pPr>
         <w:pStyle w:val="Heading2"/>
       </w:pPr>
-      <w:bookmarkStart w:id="9" w:name="_Toc244278613"/>
+      <w:bookmarkStart w:id="9" w:name="_Toc244278738"/>
       <w:r>
         <w:t>8.2 Server vision</w:t>
       </w:r>
@@ -5587,7 +5587,7 @@
       <w:pPr>
         <w:pStyle w:val="Heading1"/>
       </w:pPr>
-      <w:bookmarkStart w:id="10" w:name="_Toc244278614"/>
+      <w:bookmarkStart w:id="10" w:name="_Toc244278739"/>
       <w:r>
         <w:lastRenderedPageBreak/>
         <w:t>9. Serial dan MQTT Communication</w:t>
@@ -6356,7 +6356,7 @@
       <w:pPr>
         <w:pStyle w:val="Heading1"/>
       </w:pPr>
-      <w:bookmarkStart w:id="11" w:name="_Toc244278615"/>
+      <w:bookmarkStart w:id="11" w:name="_Toc244278740"/>
       <w:r>
         <w:t>10. Dashboard dan Visualization</w:t>
       </w:r>
@@ -6383,7 +6383,7 @@
         </w:rPr>
         <w:lastRenderedPageBreak/>
         <w:drawing>
-          <wp:inline distT="0" distB="0" distL="0" distR="0" wp14:anchorId="4366D498" wp14:editId="5AF69984">
+          <wp:inline distT="0" distB="0" distL="0" distR="0" wp14:anchorId="4E5BDA09" wp14:editId="34C8645C">
             <wp:extent cx="3781425" cy="3333750"/>
             <wp:effectExtent l="0" t="0" r="0" b="0"/>
             <wp:docPr id="4" name="dash" descr="Tampilan dashboard IRIS: status node dan ringkasan" title="Tampilan dashboard IRIS: status node dan ringkasan"/>
@@ -6449,7 +6449,7 @@
           <w:noProof/>
         </w:rPr>
         <w:drawing>
-          <wp:inline distT="0" distB="0" distL="0" distR="0" wp14:anchorId="416C560A" wp14:editId="742D857C">
+          <wp:inline distT="0" distB="0" distL="0" distR="0" wp14:anchorId="06BEF624" wp14:editId="66F578F3">
             <wp:extent cx="3419475" cy="2771775"/>
             <wp:effectExtent l="0" t="0" r="0" b="0"/>
             <wp:docPr id="5" name="dash2" descr="Grafik compliance rate pada dashboard" title="Grafik compliance rate pada dashboard"/>
@@ -6508,7 +6508,7 @@
       <w:pPr>
         <w:pStyle w:val="Heading1"/>
       </w:pPr>
-      <w:bookmarkStart w:id="12" w:name="_Toc244278616"/>
+      <w:bookmarkStart w:id="12" w:name="_Toc244278741"/>
       <w:r>
         <w:t>11. Test Scenario dan Hasil Pengujian</w:t>
       </w:r>
@@ -6527,7 +6527,7 @@
       <w:pPr>
         <w:pStyle w:val="Heading2"/>
       </w:pPr>
-      <w:bookmarkStart w:id="13" w:name="_Toc244278617"/>
+      <w:bookmarkStart w:id="13" w:name="_Toc244278742"/>
       <w:r>
         <w:t>11.1 Pengujian dengan simulator dan video uji</w:t>
       </w:r>
@@ -7601,7 +7601,7 @@
       <w:pPr>
         <w:pStyle w:val="Heading2"/>
       </w:pPr>
-      <w:bookmarkStart w:id="14" w:name="_Toc244278618"/>
+      <w:bookmarkStart w:id="14" w:name="_Toc244278743"/>
       <w:r>
         <w:t>11.2 Pengujian langsung (webcam USB, helm, dan rompi asli)</w:t>
       </w:r>
@@ -7919,9 +7919,16 @@
               <w:rPr>
                 <w:sz w:val="19"/>
                 <w:szCs w:val="19"/>
-                <w:highlight w:val="yellow"/>
-              </w:rPr>
-              <w:t>[Isi setelah cek video]</w:t>
+              </w:rPr>
+              <w:t xml:space="preserve">Palang terbuka, LED hijau, </w:t>
+            </w:r>
+            <w:r>
+              <w:rPr>
+                <w:rFonts w:ascii="Consolas" w:eastAsia="Consolas" w:hAnsi="Consolas" w:cs="Consolas"/>
+                <w:sz w:val="19"/>
+                <w:szCs w:val="19"/>
+              </w:rPr>
+              <w:t>GRANTED</w:t>
             </w:r>
           </w:p>
         </w:tc>
@@ -7946,9 +7953,8 @@
               <w:rPr>
                 <w:sz w:val="19"/>
                 <w:szCs w:val="19"/>
-                <w:highlight w:val="yellow"/>
-              </w:rPr>
-              <w:t>[?]</w:t>
+              </w:rPr>
+              <w:t>Lulus</w:t>
             </w:r>
           </w:p>
         </w:tc>
@@ -8056,9 +8062,8 @@
               <w:rPr>
                 <w:sz w:val="19"/>
                 <w:szCs w:val="19"/>
-                <w:highlight w:val="yellow"/>
-              </w:rPr>
-              <w:t>[Isi setelah cek video]</w:t>
+              </w:rPr>
+              <w:t>Palang tertutup, buzzer, OLED "Kurang: ROMPI"</w:t>
             </w:r>
           </w:p>
         </w:tc>
@@ -8083,9 +8088,8 @@
               <w:rPr>
                 <w:sz w:val="19"/>
                 <w:szCs w:val="19"/>
-                <w:highlight w:val="yellow"/>
-              </w:rPr>
-              <w:t>[?]</w:t>
+              </w:rPr>
+              <w:t>Lulus</w:t>
             </w:r>
           </w:p>
         </w:tc>
@@ -8191,11 +8195,18 @@
           <w:p>
             <w:r>
               <w:rPr>
-                <w:sz w:val="19"/>
-                <w:szCs w:val="19"/>
-                <w:highlight w:val="yellow"/>
-              </w:rPr>
-              <w:t>[Isi setelah cek video]</w:t>
+                <w:rFonts w:ascii="Consolas" w:eastAsia="Consolas" w:hAnsi="Consolas" w:cs="Consolas"/>
+                <w:sz w:val="19"/>
+                <w:szCs w:val="19"/>
+              </w:rPr>
+              <w:t>FAULT</w:t>
+            </w:r>
+            <w:r>
+              <w:rPr>
+                <w:sz w:val="19"/>
+                <w:szCs w:val="19"/>
+              </w:rPr>
+              <w:t>: gerbang terkunci, OLED "OFFLINE"</w:t>
             </w:r>
           </w:p>
         </w:tc>
@@ -8220,9 +8231,8 @@
               <w:rPr>
                 <w:sz w:val="19"/>
                 <w:szCs w:val="19"/>
-                <w:highlight w:val="yellow"/>
-              </w:rPr>
-              <w:t>[?]</w:t>
+              </w:rPr>
+              <w:t>Lulus</w:t>
             </w:r>
           </w:p>
         </w:tc>
@@ -8330,9 +8340,23 @@
               <w:rPr>
                 <w:sz w:val="19"/>
                 <w:szCs w:val="19"/>
-                <w:highlight w:val="yellow"/>
-              </w:rPr>
-              <w:t>[Isi setelah cek video]</w:t>
+              </w:rPr>
+              <w:t xml:space="preserve">Palang tetap tertutup, </w:t>
+            </w:r>
+            <w:r>
+              <w:rPr>
+                <w:rFonts w:ascii="Consolas" w:eastAsia="Consolas" w:hAnsi="Consolas" w:cs="Consolas"/>
+                <w:sz w:val="19"/>
+                <w:szCs w:val="19"/>
+              </w:rPr>
+              <w:t>DENIED</w:t>
+            </w:r>
+            <w:r>
+              <w:rPr>
+                <w:sz w:val="19"/>
+                <w:szCs w:val="19"/>
+              </w:rPr>
+              <w:t>, missing=vest</w:t>
             </w:r>
           </w:p>
         </w:tc>
@@ -8357,9 +8381,8 @@
               <w:rPr>
                 <w:sz w:val="19"/>
                 <w:szCs w:val="19"/>
-                <w:highlight w:val="yellow"/>
-              </w:rPr>
-              <w:t>[?]</w:t>
+              </w:rPr>
+              <w:t>Lulus</w:t>
             </w:r>
           </w:p>
         </w:tc>
@@ -8465,11 +8488,18 @@
           <w:p>
             <w:r>
               <w:rPr>
-                <w:sz w:val="19"/>
-                <w:szCs w:val="19"/>
-                <w:highlight w:val="yellow"/>
-              </w:rPr>
-              <w:t>[Isi setelah cek video]</w:t>
+                <w:rFonts w:ascii="Consolas" w:eastAsia="Consolas" w:hAnsi="Consolas" w:cs="Consolas"/>
+                <w:sz w:val="19"/>
+                <w:szCs w:val="19"/>
+              </w:rPr>
+              <w:t>GRANTED -&gt; DENIED</w:t>
+            </w:r>
+            <w:r>
+              <w:rPr>
+                <w:sz w:val="19"/>
+                <w:szCs w:val="19"/>
+              </w:rPr>
+              <w:t>, palang menutup, buzzer</w:t>
             </w:r>
           </w:p>
         </w:tc>
@@ -8494,9 +8524,8 @@
               <w:rPr>
                 <w:sz w:val="19"/>
                 <w:szCs w:val="19"/>
-                <w:highlight w:val="yellow"/>
-              </w:rPr>
-              <w:t>[?]</w:t>
+              </w:rPr>
+              <w:t>Lulus</w:t>
             </w:r>
           </w:p>
         </w:tc>
@@ -8661,7 +8690,7 @@
       <w:pPr>
         <w:pStyle w:val="Heading2"/>
       </w:pPr>
-      <w:bookmarkStart w:id="15" w:name="_Toc244278619"/>
+      <w:bookmarkStart w:id="15" w:name="_Toc244278744"/>
       <w:r>
         <w:t>11.3 Temuan dan perbaikan selama pengujian</w:t>
       </w:r>
@@ -8821,7 +8850,7 @@
       <w:pPr>
         <w:pStyle w:val="Heading1"/>
       </w:pPr>
-      <w:bookmarkStart w:id="16" w:name="_Toc244278620"/>
+      <w:bookmarkStart w:id="16" w:name="_Toc244278745"/>
       <w:r>
         <w:t>12. Screenshot dan Output</w:t>
       </w:r>
@@ -8838,7 +8867,7 @@
           <w:noProof/>
         </w:rPr>
         <w:drawing>
-          <wp:inline distT="0" distB="0" distL="0" distR="0" wp14:anchorId="1166EDAC" wp14:editId="34B88A45">
+          <wp:inline distT="0" distB="0" distL="0" distR="0" wp14:anchorId="722DF31E" wp14:editId="67D4B4DD">
             <wp:extent cx="1714500" cy="857250"/>
             <wp:effectExtent l="0" t="0" r="0" b="0"/>
             <wp:docPr id="6" name="oled_g" descr="Tampilan OLED oled_g" title="oled_g"/>
@@ -8884,7 +8913,7 @@
           <w:noProof/>
         </w:rPr>
         <w:drawing>
-          <wp:inline distT="0" distB="0" distL="0" distR="0" wp14:anchorId="269D480B" wp14:editId="7AE192B4">
+          <wp:inline distT="0" distB="0" distL="0" distR="0" wp14:anchorId="662B82EF" wp14:editId="2E4B064F">
             <wp:extent cx="1714500" cy="857250"/>
             <wp:effectExtent l="0" t="0" r="0" b="0"/>
             <wp:docPr id="7" name="oled_d" descr="Tampilan OLED oled_d" title="oled_d"/>
@@ -8930,7 +8959,7 @@
           <w:noProof/>
         </w:rPr>
         <w:drawing>
-          <wp:inline distT="0" distB="0" distL="0" distR="0" wp14:anchorId="3AC5F2E2" wp14:editId="5703ACBB">
+          <wp:inline distT="0" distB="0" distL="0" distR="0" wp14:anchorId="0F3DC55E" wp14:editId="4FC95142">
             <wp:extent cx="1714500" cy="857250"/>
             <wp:effectExtent l="0" t="0" r="0" b="0"/>
             <wp:docPr id="8" name="oled_f" descr="Tampilan OLED oled_f" title="oled_f"/>
@@ -8980,7 +9009,7 @@
           <w:noProof/>
         </w:rPr>
         <w:drawing>
-          <wp:inline distT="0" distB="0" distL="0" distR="0" wp14:anchorId="4306599A" wp14:editId="65A8305A">
+          <wp:inline distT="0" distB="0" distL="0" distR="0" wp14:anchorId="793F2DF6" wp14:editId="07D3202B">
             <wp:extent cx="1714500" cy="857250"/>
             <wp:effectExtent l="0" t="0" r="0" b="0"/>
             <wp:docPr id="9" name="oled_w" descr="Tampilan OLED oled_w" title="oled_w"/>
@@ -9026,7 +9055,7 @@
           <w:noProof/>
         </w:rPr>
         <w:drawing>
-          <wp:inline distT="0" distB="0" distL="0" distR="0" wp14:anchorId="0053CA82" wp14:editId="298CA097">
+          <wp:inline distT="0" distB="0" distL="0" distR="0" wp14:anchorId="4985D761" wp14:editId="2EA48233">
             <wp:extent cx="1714500" cy="857250"/>
             <wp:effectExtent l="0" t="0" r="0" b="0"/>
             <wp:docPr id="10" name="oled_a" descr="Tampilan OLED oled_a" title="oled_a"/>
@@ -9116,7 +9145,7 @@
           <w:noProof/>
         </w:rPr>
         <w:drawing>
-          <wp:inline distT="0" distB="0" distL="0" distR="0" wp14:anchorId="12F97FA6" wp14:editId="08A2CD6A">
+          <wp:inline distT="0" distB="0" distL="0" distR="0" wp14:anchorId="7823AFD2" wp14:editId="0C1D0E91">
             <wp:extent cx="5724525" cy="2867025"/>
             <wp:effectExtent l="0" t="0" r="0" b="0"/>
             <wp:docPr id="11" name="results" descr="Grafik training model final" title="Grafik training model final"/>
@@ -9183,7 +9212,7 @@
         </w:rPr>
         <w:lastRenderedPageBreak/>
         <w:drawing>
-          <wp:inline distT="0" distB="0" distL="0" distR="0" wp14:anchorId="68AF0145" wp14:editId="1CD0A2E3">
+          <wp:inline distT="0" distB="0" distL="0" distR="0" wp14:anchorId="51C48D24" wp14:editId="7C678E51">
             <wp:extent cx="4324350" cy="2886075"/>
             <wp:effectExtent l="0" t="0" r="0" b="0"/>
             <wp:docPr id="12" name="pr" descr="Kurva Precision-Recall pada test publik" title="Kurva Precision-Recall pada test publik"/>
@@ -9249,7 +9278,7 @@
           <w:noProof/>
         </w:rPr>
         <w:drawing>
-          <wp:inline distT="0" distB="0" distL="0" distR="0" wp14:anchorId="0B05AABF" wp14:editId="7374116A">
+          <wp:inline distT="0" distB="0" distL="0" distR="0" wp14:anchorId="2BCBBD60" wp14:editId="422CE0C5">
             <wp:extent cx="4324350" cy="3248025"/>
             <wp:effectExtent l="0" t="0" r="0" b="0"/>
             <wp:docPr id="13" name="cm" descr="Confusion matrix ternormalisasi pada test publik" title="Confusion matrix ternormalisasi pada test publik"/>
@@ -9308,7 +9337,7 @@
       <w:pPr>
         <w:pStyle w:val="Heading1"/>
       </w:pPr>
-      <w:bookmarkStart w:id="17" w:name="_Toc244278621"/>
+      <w:bookmarkStart w:id="17" w:name="_Toc244278746"/>
       <w:r>
         <w:t>13. Pembagian Peran Anggota</w:t>
       </w:r>
@@ -9807,7 +9836,7 @@
       <w:pPr>
         <w:pStyle w:val="Heading1"/>
       </w:pPr>
-      <w:bookmarkStart w:id="18" w:name="_Toc244278622"/>
+      <w:bookmarkStart w:id="18" w:name="_Toc244278747"/>
       <w:r>
         <w:t>14. Kesimpulan</w:t>
       </w:r>
@@ -9819,10 +9848,10 @@
         <w:jc w:val="both"/>
       </w:pPr>
       <w:r>
-        <w:t>IRIS berhasil mengintegrasikan computer vision, ESP32, komunikasi MQTT, dan dashboard menjadi sistem pengawasan APD dengan dua mode, yaitu gerbang dan monitoring zona. Seluruh rangkaian disimulasikan di Wokwi, sedangkan server vision berjalan di laptop dengan model YOLO26m. Skenario T1–T6 lulus pada pengujian simulator dan video uji, dan pengujian langsung dengan webcam serta APD asli dicatat pada Tabel 7. Fail-safe mengunci gerbang saat server vision berhenti, dan dashboard memberi catatan kejadian yang se</w:t>
-      </w:r>
-      <w:r>
-        <w:t>belumnya tidak terdokumentasi pada pengawasan manual.</w:t>
+        <w:t>IRIS berhasil mengintegrasikan computer vision, ESP32, komunikasi MQTT, dan dashboard menjadi sistem pengawasan APD dengan dua mode, yaitu gerbang dan monitoring zona. Seluruh rangkaian disimulasikan di Wokwi, sedangkan server vision berjalan di laptop dengan model YOLO26m. Skenario T1–T6 lulus pada pengujian simulator dan video uji, serta pada pengujian langsung dengan webcam, helm, dan rompi asli (Tabel 7). Fail-safe mengunci gerbang saat server vision berhenti, dan dashboard memberi catatan kejadian yang</w:t>
+      </w:r>
+      <w:r>
+        <w:t xml:space="preserve"> sebelumnya tidak terdokumentasi pada pengawasan manual.</w:t>
       </w:r>
     </w:p>
     <w:p>
@@ -9904,7 +9933,7 @@
       <w:pPr>
         <w:pStyle w:val="Heading1"/>
       </w:pPr>
-      <w:bookmarkStart w:id="19" w:name="_Toc244278623"/>
+      <w:bookmarkStart w:id="19" w:name="_Toc244278748"/>
       <w:r>
         <w:t>15. Pengembangan Lanjutan</w:t>
       </w:r>
@@ -9979,7 +10008,7 @@
       <w:pPr>
         <w:pStyle w:val="Heading1"/>
       </w:pPr>
-      <w:bookmarkStart w:id="20" w:name="_Toc244278624"/>
+      <w:bookmarkStart w:id="20" w:name="_Toc244278749"/>
       <w:r>
         <w:t>Lampiran: Tautan Proyek</w:t>
       </w:r>
@@ -10047,7 +10076,7 @@
       <w:pPr>
         <w:pStyle w:val="Heading1"/>
       </w:pPr>
-      <w:bookmarkStart w:id="21" w:name="_Toc244278625"/>
+      <w:bookmarkStart w:id="21" w:name="_Toc244278750"/>
       <w:r>
         <w:lastRenderedPageBreak/>
         <w:t>Daftar Pustaka</w:t>
@@ -10265,64 +10294,150 @@
 <file path=word/numbering.xml><?xml version="1.0" encoding="utf-8"?>
 <w:numbering xmlns:wpc="http://schemas.microsoft.com/office/word/2010/wordprocessingCanvas" xmlns:cx="http://schemas.microsoft.com/office/drawing/2014/chartex" xmlns:cx1="http://schemas.microsoft.com/office/drawing/2015/9/8/chartex" xmlns:cx2="http://schemas.microsoft.com/office/drawing/2015/10/21/chartex" xmlns:cx3="http://schemas.microsoft.com/office/drawing/2016/5/9/chartex" xmlns:cx4="http://schemas.microsoft.com/office/drawing/2016/5/10/chartex" xmlns:cx5="http://schemas.microsoft.com/office/drawing/2016/5/11/chartex" xmlns:cx6="http://schemas.microsoft.com/office/drawing/2016/5/12/chartex" xmlns:cx7="http://schemas.microsoft.com/office/drawing/2016/5/13/chartex" xmlns:cx8="http://schemas.microsoft.com/office/drawing/2016/5/14/chartex" xmlns:mc="http://schemas.openxmlformats.org/markup-compatibility/2006" xmlns:aink="http://schemas.microsoft.com/office/drawing/2016/ink" xmlns:am3d="http://schemas.microsoft.com/office/drawing/2017/model3d" xmlns:o="urn:schemas-microsoft-com:office:office" xmlns:oel="http://schemas.microsoft.com/office/2019/extlst" xmlns:r="http://schemas.openxmlformats.org/officeDocument/2006/relationships" xmlns:m="http://schemas.openxmlformats.org/officeDocument/2006/math" xmlns:v="urn:schemas-microsoft-com:vml" xmlns:wp14="http://schemas.microsoft.com/office/word/2010/wordprocessingDrawing" xmlns:wp="http://schemas.openxmlformats.org/drawingml/2006/wordprocessingDrawing" xmlns:w10="urn:schemas-microsoft-com:office:word" xmlns:w="http://schemas.openxmlformats.org/wordprocessingml/2006/main" xmlns:w14="http://schemas.microsoft.com/office/word/2010/wordml" xmlns:w15="http://schemas.microsoft.com/office/word/2012/wordml" xmlns:w16cex="http://schemas.microsoft.com/office/word/2018/wordml/cex" xmlns:w16cid="http://schemas.microsoft.com/office/word/2016/wordml/cid" xmlns:w16="http://schemas.microsoft.com/office/word/2018/wordml" xmlns:w16du="http://schemas.microsoft.com/office/word/2023/wordml/word16du" xmlns:w16sdtdh="http://schemas.microsoft.com/office/word/2020/wordml/sdtdatahash" xmlns:w16sdtfl="http://schemas.microsoft.com/office/word/2024/wordml/sdtformatlock" xmlns:w16se="http://schemas.microsoft.com/office/word/2015/wordml/symex" xmlns:wpg="http://schemas.microsoft.com/office/word/2010/wordprocessingGroup" xmlns:wpi="http://schemas.microsoft.com/office/word/2010/wordprocessingInk" xmlns:wne="http://schemas.microsoft.com/office/word/2006/wordml" xmlns:wps="http://schemas.microsoft.com/office/word/2010/wordprocessingShape" mc:Ignorable="w14 w15 w16se w16cid w16 w16cex w16sdtdh w16sdtfl w16du wp14">
   <w:abstractNum w:abstractNumId="0" w15:restartNumberingAfterBreak="0">
-    <w:nsid w:val="2F20081A"/>
+    <w:nsid w:val="1CB455AE"/>
     <w:multiLevelType w:val="hybridMultilevel"/>
-    <w:tmpl w:val="E368C70C"/>
-    <w:lvl w:ilvl="0" w:tplc="AAF4E67A">
+    <w:tmpl w:val="5502BC18"/>
+    <w:lvl w:ilvl="0" w:tplc="73E0E020">
       <w:start w:val="1"/>
-      <w:numFmt w:val="decimal"/>
-      <w:lvlText w:val="%1."/>
+      <w:numFmt w:val="bullet"/>
+      <w:lvlText w:val="•"/>
       <w:lvlJc w:val="left"/>
       <w:pPr>
-        <w:ind w:left="400" w:hanging="300"/>
+        <w:ind w:left="400" w:hanging="240"/>
       </w:pPr>
     </w:lvl>
-    <w:lvl w:ilvl="1" w:tplc="5A8ABBBA">
+    <w:lvl w:ilvl="1" w:tplc="D722BD6C">
       <w:numFmt w:val="decimal"/>
       <w:lvlText w:val=""/>
       <w:lvlJc w:val="left"/>
     </w:lvl>
-    <w:lvl w:ilvl="2" w:tplc="41781716">
+    <w:lvl w:ilvl="2" w:tplc="887442DC">
       <w:numFmt w:val="decimal"/>
       <w:lvlText w:val=""/>
       <w:lvlJc w:val="left"/>
     </w:lvl>
-    <w:lvl w:ilvl="3" w:tplc="1004E430">
+    <w:lvl w:ilvl="3" w:tplc="54A00E2C">
       <w:numFmt w:val="decimal"/>
       <w:lvlText w:val=""/>
       <w:lvlJc w:val="left"/>
     </w:lvl>
-    <w:lvl w:ilvl="4" w:tplc="9440DDF0">
+    <w:lvl w:ilvl="4" w:tplc="EE38A058">
       <w:numFmt w:val="decimal"/>
       <w:lvlText w:val=""/>
       <w:lvlJc w:val="left"/>
     </w:lvl>
-    <w:lvl w:ilvl="5" w:tplc="C9C4D7E4">
+    <w:lvl w:ilvl="5" w:tplc="C05CFE62">
       <w:numFmt w:val="decimal"/>
       <w:lvlText w:val=""/>
       <w:lvlJc w:val="left"/>
     </w:lvl>
-    <w:lvl w:ilvl="6" w:tplc="F6221376">
+    <w:lvl w:ilvl="6" w:tplc="7C146D34">
       <w:numFmt w:val="decimal"/>
       <w:lvlText w:val=""/>
       <w:lvlJc w:val="left"/>
     </w:lvl>
-    <w:lvl w:ilvl="7" w:tplc="EAD6C9FE">
+    <w:lvl w:ilvl="7" w:tplc="DA36E7EE">
       <w:numFmt w:val="decimal"/>
       <w:lvlText w:val=""/>
       <w:lvlJc w:val="left"/>
     </w:lvl>
-    <w:lvl w:ilvl="8" w:tplc="8A7ADF26">
+    <w:lvl w:ilvl="8" w:tplc="155E0C0A">
       <w:numFmt w:val="decimal"/>
       <w:lvlText w:val=""/>
       <w:lvlJc w:val="left"/>
     </w:lvl>
   </w:abstractNum>
   <w:abstractNum w:abstractNumId="1" w15:restartNumberingAfterBreak="0">
-    <w:nsid w:val="51207335"/>
+    <w:nsid w:val="2434051E"/>
     <w:multiLevelType w:val="hybridMultilevel"/>
-    <w:tmpl w:val="EEF84954"/>
-    <w:lvl w:ilvl="0" w:tplc="AFEA26BC">
+    <w:tmpl w:val="3F9EDC0A"/>
+    <w:lvl w:ilvl="0" w:tplc="1FC42B6E" w:tentative="1">
+      <w:start w:val="1"/>
+      <w:numFmt w:val="bullet"/>
+      <w:lvlText w:val="●"/>
+      <w:lvlJc w:val="left"/>
+      <w:pPr>
+        <w:ind w:left="720" w:hanging="360"/>
+      </w:pPr>
+    </w:lvl>
+    <w:lvl w:ilvl="1" w:tplc="9CC23378" w:tentative="1">
+      <w:start w:val="1"/>
+      <w:numFmt w:val="bullet"/>
+      <w:lvlText w:val="○"/>
+      <w:lvlJc w:val="left"/>
+      <w:pPr>
+        <w:ind w:left="1440" w:hanging="360"/>
+      </w:pPr>
+    </w:lvl>
+    <w:lvl w:ilvl="2" w:tplc="114275BE" w:tentative="1">
+      <w:start w:val="1"/>
+      <w:numFmt w:val="bullet"/>
+      <w:lvlText w:val="■"/>
+      <w:lvlJc w:val="left"/>
+      <w:pPr>
+        <w:ind w:left="2160" w:hanging="360"/>
+      </w:pPr>
+    </w:lvl>
+    <w:lvl w:ilvl="3" w:tplc="5AB690C8" w:tentative="1">
+      <w:start w:val="1"/>
+      <w:numFmt w:val="bullet"/>
+      <w:lvlText w:val="●"/>
+      <w:lvlJc w:val="left"/>
+      <w:pPr>
+        <w:ind w:left="2880" w:hanging="360"/>
+      </w:pPr>
+    </w:lvl>
+    <w:lvl w:ilvl="4" w:tplc="AE5459C0" w:tentative="1">
+      <w:start w:val="1"/>
+      <w:numFmt w:val="bullet"/>
+      <w:lvlText w:val="○"/>
+      <w:lvlJc w:val="left"/>
+      <w:pPr>
+        <w:ind w:left="3600" w:hanging="360"/>
+      </w:pPr>
+    </w:lvl>
+    <w:lvl w:ilvl="5" w:tplc="72C6B198" w:tentative="1">
+      <w:start w:val="1"/>
+      <w:numFmt w:val="bullet"/>
+      <w:lvlText w:val="■"/>
+      <w:lvlJc w:val="left"/>
+      <w:pPr>
+        <w:ind w:left="4320" w:hanging="360"/>
+      </w:pPr>
+    </w:lvl>
+    <w:lvl w:ilvl="6" w:tplc="A4F49EA0" w:tentative="1">
+      <w:start w:val="1"/>
+      <w:numFmt w:val="bullet"/>
+      <w:lvlText w:val="●"/>
+      <w:lvlJc w:val="left"/>
+      <w:pPr>
+        <w:ind w:left="5040" w:hanging="360"/>
+      </w:pPr>
+    </w:lvl>
+    <w:lvl w:ilvl="7" w:tplc="CB16A104" w:tentative="1">
+      <w:start w:val="1"/>
+      <w:numFmt w:val="bullet"/>
+      <w:lvlText w:val="●"/>
+      <w:lvlJc w:val="left"/>
+      <w:pPr>
+        <w:ind w:left="5760" w:hanging="360"/>
+      </w:pPr>
+    </w:lvl>
+    <w:lvl w:ilvl="8" w:tplc="98F0A856" w:tentative="1">
+      <w:start w:val="1"/>
+      <w:numFmt w:val="bullet"/>
+      <w:lvlText w:val="●"/>
+      <w:lvlJc w:val="left"/>
+      <w:pPr>
+        <w:ind w:left="6480" w:hanging="360"/>
+      </w:pPr>
+    </w:lvl>
+  </w:abstractNum>
+  <w:abstractNum w:abstractNumId="2" w15:restartNumberingAfterBreak="0">
+    <w:nsid w:val="2B982711"/>
+    <w:multiLevelType w:val="hybridMultilevel"/>
+    <w:tmpl w:val="FD0C7C62"/>
+    <w:lvl w:ilvl="0" w:tplc="4D0E9C30">
       <w:start w:val="1"/>
       <w:numFmt w:val="decimal"/>
       <w:lvlText w:val="%1."/>
@@ -10331,192 +10446,106 @@
         <w:ind w:left="400" w:hanging="300"/>
       </w:pPr>
     </w:lvl>
-    <w:lvl w:ilvl="1" w:tplc="86C0E218">
+    <w:lvl w:ilvl="1" w:tplc="59580902">
       <w:numFmt w:val="decimal"/>
       <w:lvlText w:val=""/>
       <w:lvlJc w:val="left"/>
     </w:lvl>
-    <w:lvl w:ilvl="2" w:tplc="690A0D9C">
+    <w:lvl w:ilvl="2" w:tplc="CED694D0">
       <w:numFmt w:val="decimal"/>
       <w:lvlText w:val=""/>
       <w:lvlJc w:val="left"/>
     </w:lvl>
-    <w:lvl w:ilvl="3" w:tplc="97622600">
+    <w:lvl w:ilvl="3" w:tplc="9656E3CA">
       <w:numFmt w:val="decimal"/>
       <w:lvlText w:val=""/>
       <w:lvlJc w:val="left"/>
     </w:lvl>
-    <w:lvl w:ilvl="4" w:tplc="29642C0C">
+    <w:lvl w:ilvl="4" w:tplc="4600F06C">
       <w:numFmt w:val="decimal"/>
       <w:lvlText w:val=""/>
       <w:lvlJc w:val="left"/>
     </w:lvl>
-    <w:lvl w:ilvl="5" w:tplc="1930AB54">
+    <w:lvl w:ilvl="5" w:tplc="F5B4C5D4">
       <w:numFmt w:val="decimal"/>
       <w:lvlText w:val=""/>
       <w:lvlJc w:val="left"/>
     </w:lvl>
-    <w:lvl w:ilvl="6" w:tplc="3C923422">
+    <w:lvl w:ilvl="6" w:tplc="FD5C41EA">
       <w:numFmt w:val="decimal"/>
       <w:lvlText w:val=""/>
       <w:lvlJc w:val="left"/>
     </w:lvl>
-    <w:lvl w:ilvl="7" w:tplc="77AEB71A">
+    <w:lvl w:ilvl="7" w:tplc="FB1ADAFA">
       <w:numFmt w:val="decimal"/>
       <w:lvlText w:val=""/>
       <w:lvlJc w:val="left"/>
     </w:lvl>
-    <w:lvl w:ilvl="8" w:tplc="E7266124">
+    <w:lvl w:ilvl="8" w:tplc="3F8C6788">
       <w:numFmt w:val="decimal"/>
       <w:lvlText w:val=""/>
       <w:lvlJc w:val="left"/>
     </w:lvl>
   </w:abstractNum>
-  <w:abstractNum w:abstractNumId="2" w15:restartNumberingAfterBreak="0">
-    <w:nsid w:val="56E37B09"/>
+  <w:abstractNum w:abstractNumId="3" w15:restartNumberingAfterBreak="0">
+    <w:nsid w:val="2FB0290A"/>
     <w:multiLevelType w:val="hybridMultilevel"/>
-    <w:tmpl w:val="AEF4594C"/>
-    <w:lvl w:ilvl="0" w:tplc="5038FB34" w:tentative="1">
+    <w:tmpl w:val="1D20AB64"/>
+    <w:lvl w:ilvl="0" w:tplc="AC7A41A2">
       <w:start w:val="1"/>
-      <w:numFmt w:val="bullet"/>
-      <w:lvlText w:val="●"/>
+      <w:numFmt w:val="decimal"/>
+      <w:lvlText w:val="%1."/>
       <w:lvlJc w:val="left"/>
       <w:pPr>
-        <w:ind w:left="720" w:hanging="360"/>
+        <w:ind w:left="400" w:hanging="300"/>
       </w:pPr>
     </w:lvl>
-    <w:lvl w:ilvl="1" w:tplc="B80C35A6" w:tentative="1">
-      <w:start w:val="1"/>
-      <w:numFmt w:val="bullet"/>
-      <w:lvlText w:val="○"/>
-      <w:lvlJc w:val="left"/>
-      <w:pPr>
-        <w:ind w:left="1440" w:hanging="360"/>
-      </w:pPr>
-    </w:lvl>
-    <w:lvl w:ilvl="2" w:tplc="68E6E134" w:tentative="1">
-      <w:start w:val="1"/>
-      <w:numFmt w:val="bullet"/>
-      <w:lvlText w:val="■"/>
-      <w:lvlJc w:val="left"/>
-      <w:pPr>
-        <w:ind w:left="2160" w:hanging="360"/>
-      </w:pPr>
-    </w:lvl>
-    <w:lvl w:ilvl="3" w:tplc="22DE24B0" w:tentative="1">
-      <w:start w:val="1"/>
-      <w:numFmt w:val="bullet"/>
-      <w:lvlText w:val="●"/>
-      <w:lvlJc w:val="left"/>
-      <w:pPr>
-        <w:ind w:left="2880" w:hanging="360"/>
-      </w:pPr>
-    </w:lvl>
-    <w:lvl w:ilvl="4" w:tplc="0158FDBC" w:tentative="1">
-      <w:start w:val="1"/>
-      <w:numFmt w:val="bullet"/>
-      <w:lvlText w:val="○"/>
-      <w:lvlJc w:val="left"/>
-      <w:pPr>
-        <w:ind w:left="3600" w:hanging="360"/>
-      </w:pPr>
-    </w:lvl>
-    <w:lvl w:ilvl="5" w:tplc="B85E6A44" w:tentative="1">
-      <w:start w:val="1"/>
-      <w:numFmt w:val="bullet"/>
-      <w:lvlText w:val="■"/>
-      <w:lvlJc w:val="left"/>
-      <w:pPr>
-        <w:ind w:left="4320" w:hanging="360"/>
-      </w:pPr>
-    </w:lvl>
-    <w:lvl w:ilvl="6" w:tplc="2446F9C6" w:tentative="1">
-      <w:start w:val="1"/>
-      <w:numFmt w:val="bullet"/>
-      <w:lvlText w:val="●"/>
-      <w:lvlJc w:val="left"/>
-      <w:pPr>
-        <w:ind w:left="5040" w:hanging="360"/>
-      </w:pPr>
-    </w:lvl>
-    <w:lvl w:ilvl="7" w:tplc="D054D052" w:tentative="1">
-      <w:start w:val="1"/>
-      <w:numFmt w:val="bullet"/>
-      <w:lvlText w:val="●"/>
-      <w:lvlJc w:val="left"/>
-      <w:pPr>
-        <w:ind w:left="5760" w:hanging="360"/>
-      </w:pPr>
-    </w:lvl>
-    <w:lvl w:ilvl="8" w:tplc="76181252" w:tentative="1">
-      <w:start w:val="1"/>
-      <w:numFmt w:val="bullet"/>
-      <w:lvlText w:val="●"/>
-      <w:lvlJc w:val="left"/>
-      <w:pPr>
-        <w:ind w:left="6480" w:hanging="360"/>
-      </w:pPr>
-    </w:lvl>
-  </w:abstractNum>
-  <w:abstractNum w:abstractNumId="3" w15:restartNumberingAfterBreak="0">
-    <w:nsid w:val="69360FD0"/>
-    <w:multiLevelType w:val="hybridMultilevel"/>
-    <w:tmpl w:val="8F5432B0"/>
-    <w:lvl w:ilvl="0" w:tplc="E5F0D720">
-      <w:start w:val="1"/>
-      <w:numFmt w:val="bullet"/>
-      <w:lvlText w:val="•"/>
-      <w:lvlJc w:val="left"/>
-      <w:pPr>
-        <w:ind w:left="400" w:hanging="240"/>
-      </w:pPr>
-    </w:lvl>
-    <w:lvl w:ilvl="1" w:tplc="A062738C">
+    <w:lvl w:ilvl="1" w:tplc="4AC83C44">
       <w:numFmt w:val="decimal"/>
       <w:lvlText w:val=""/>
       <w:lvlJc w:val="left"/>
     </w:lvl>
-    <w:lvl w:ilvl="2" w:tplc="3E78CD5E">
+    <w:lvl w:ilvl="2" w:tplc="48EE1F5C">
       <w:numFmt w:val="decimal"/>
       <w:lvlText w:val=""/>
       <w:lvlJc w:val="left"/>
     </w:lvl>
-    <w:lvl w:ilvl="3" w:tplc="3014E2A2">
+    <w:lvl w:ilvl="3" w:tplc="8BE0BA30">
       <w:numFmt w:val="decimal"/>
       <w:lvlText w:val=""/>
       <w:lvlJc w:val="left"/>
     </w:lvl>
-    <w:lvl w:ilvl="4" w:tplc="EB4EC89E">
+    <w:lvl w:ilvl="4" w:tplc="5A92ECB0">
       <w:numFmt w:val="decimal"/>
       <w:lvlText w:val=""/>
       <w:lvlJc w:val="left"/>
     </w:lvl>
-    <w:lvl w:ilvl="5" w:tplc="D58E65B0">
+    <w:lvl w:ilvl="5" w:tplc="B7C82050">
       <w:numFmt w:val="decimal"/>
       <w:lvlText w:val=""/>
       <w:lvlJc w:val="left"/>
     </w:lvl>
-    <w:lvl w:ilvl="6" w:tplc="AFDACEEE">
+    <w:lvl w:ilvl="6" w:tplc="F47CFFB2">
       <w:numFmt w:val="decimal"/>
       <w:lvlText w:val=""/>
       <w:lvlJc w:val="left"/>
     </w:lvl>
-    <w:lvl w:ilvl="7" w:tplc="32E63158">
+    <w:lvl w:ilvl="7" w:tplc="01C068DC">
       <w:numFmt w:val="decimal"/>
       <w:lvlText w:val=""/>
       <w:lvlJc w:val="left"/>
     </w:lvl>
-    <w:lvl w:ilvl="8" w:tplc="89BEA310">
+    <w:lvl w:ilvl="8" w:tplc="3F761FEA">
       <w:numFmt w:val="decimal"/>
       <w:lvlText w:val=""/>
       <w:lvlJc w:val="left"/>
     </w:lvl>
   </w:abstractNum>
   <w:abstractNum w:abstractNumId="4" w15:restartNumberingAfterBreak="0">
-    <w:nsid w:val="704C50BB"/>
+    <w:nsid w:val="311408DB"/>
     <w:multiLevelType w:val="hybridMultilevel"/>
-    <w:tmpl w:val="C688E314"/>
-    <w:lvl w:ilvl="0" w:tplc="F8C8CEC4">
+    <w:tmpl w:val="D6D8ADE8"/>
+    <w:lvl w:ilvl="0" w:tplc="3C863472">
       <w:start w:val="1"/>
       <w:numFmt w:val="decimal"/>
       <w:lvlText w:val="%1."/>
@@ -10525,73 +10554,73 @@
         <w:ind w:left="400" w:hanging="300"/>
       </w:pPr>
     </w:lvl>
-    <w:lvl w:ilvl="1" w:tplc="AC000310">
+    <w:lvl w:ilvl="1" w:tplc="691820F4">
       <w:numFmt w:val="decimal"/>
       <w:lvlText w:val=""/>
       <w:lvlJc w:val="left"/>
     </w:lvl>
-    <w:lvl w:ilvl="2" w:tplc="B89EFE3E">
+    <w:lvl w:ilvl="2" w:tplc="B46069A4">
       <w:numFmt w:val="decimal"/>
       <w:lvlText w:val=""/>
       <w:lvlJc w:val="left"/>
     </w:lvl>
-    <w:lvl w:ilvl="3" w:tplc="1DB02A40">
+    <w:lvl w:ilvl="3" w:tplc="249AA38C">
       <w:numFmt w:val="decimal"/>
       <w:lvlText w:val=""/>
       <w:lvlJc w:val="left"/>
     </w:lvl>
-    <w:lvl w:ilvl="4" w:tplc="35486442">
+    <w:lvl w:ilvl="4" w:tplc="9FF03EDE">
       <w:numFmt w:val="decimal"/>
       <w:lvlText w:val=""/>
       <w:lvlJc w:val="left"/>
     </w:lvl>
-    <w:lvl w:ilvl="5" w:tplc="CD72250E">
+    <w:lvl w:ilvl="5" w:tplc="1ABC1506">
       <w:numFmt w:val="decimal"/>
       <w:lvlText w:val=""/>
       <w:lvlJc w:val="left"/>
     </w:lvl>
-    <w:lvl w:ilvl="6" w:tplc="13E80FD4">
+    <w:lvl w:ilvl="6" w:tplc="E38856EE">
       <w:numFmt w:val="decimal"/>
       <w:lvlText w:val=""/>
       <w:lvlJc w:val="left"/>
     </w:lvl>
-    <w:lvl w:ilvl="7" w:tplc="8EE423B0">
+    <w:lvl w:ilvl="7" w:tplc="7F44C9EC">
       <w:numFmt w:val="decimal"/>
       <w:lvlText w:val=""/>
       <w:lvlJc w:val="left"/>
     </w:lvl>
-    <w:lvl w:ilvl="8" w:tplc="6E12364C">
+    <w:lvl w:ilvl="8" w:tplc="FC98E938">
       <w:numFmt w:val="decimal"/>
       <w:lvlText w:val=""/>
       <w:lvlJc w:val="left"/>
     </w:lvl>
   </w:abstractNum>
-  <w:num w:numId="1" w16cid:durableId="1563832532">
+  <w:num w:numId="1" w16cid:durableId="96339818">
+    <w:abstractNumId w:val="1"/>
+    <w:lvlOverride w:ilvl="0">
+      <w:startOverride w:val="1"/>
+    </w:lvlOverride>
+  </w:num>
+  <w:num w:numId="2" w16cid:durableId="1898395012">
+    <w:abstractNumId w:val="3"/>
+    <w:lvlOverride w:ilvl="0">
+      <w:startOverride w:val="1"/>
+    </w:lvlOverride>
+  </w:num>
+  <w:num w:numId="3" w16cid:durableId="1207377433">
+    <w:abstractNumId w:val="0"/>
+    <w:lvlOverride w:ilvl="0">
+      <w:startOverride w:val="1"/>
+    </w:lvlOverride>
+  </w:num>
+  <w:num w:numId="4" w16cid:durableId="348069962">
     <w:abstractNumId w:val="2"/>
     <w:lvlOverride w:ilvl="0">
       <w:startOverride w:val="1"/>
     </w:lvlOverride>
   </w:num>
-  <w:num w:numId="2" w16cid:durableId="1602295710">
-    <w:abstractNumId w:val="0"/>
-    <w:lvlOverride w:ilvl="0">
-      <w:startOverride w:val="1"/>
-    </w:lvlOverride>
-  </w:num>
-  <w:num w:numId="3" w16cid:durableId="243613384">
-    <w:abstractNumId w:val="3"/>
-    <w:lvlOverride w:ilvl="0">
-      <w:startOverride w:val="1"/>
-    </w:lvlOverride>
-  </w:num>
-  <w:num w:numId="4" w16cid:durableId="1482768281">
+  <w:num w:numId="5" w16cid:durableId="1921981215">
     <w:abstractNumId w:val="4"/>
-    <w:lvlOverride w:ilvl="0">
-      <w:startOverride w:val="1"/>
-    </w:lvlOverride>
-  </w:num>
-  <w:num w:numId="5" w16cid:durableId="1010989924">
-    <w:abstractNumId w:val="1"/>
     <w:lvlOverride w:ilvl="0">
       <w:startOverride w:val="1"/>
     </w:lvlOverride>

</xml_diff>